<commit_message>
Make form placeholders, demo content and CV template industry-neutral
</commit_message>
<xml_diff>
--- a/public/Canvett_CV_Template.docx
+++ b/public/Canvett_CV_Template.docx
@@ -35,7 +35,7 @@
           <w:sz w:val="36"/>
           <w:szCs w:val="36"/>
         </w:rPr>
-        <w:t xml:space="preserve">John Doe</w:t>
+        <w:t>Ama Owusu</w:t>
       </w:r>
     </w:p>
     <w:p>
@@ -48,7 +48,7 @@
           <w:sz w:val="24"/>
           <w:szCs w:val="24"/>
         </w:rPr>
-        <w:t xml:space="preserve">Frontend Developer</w:t>
+        <w:t>Accountant</w:t>
       </w:r>
     </w:p>
     <w:p>
@@ -61,7 +61,7 @@
           <w:sz w:val="18"/>
           <w:szCs w:val="18"/>
         </w:rPr>
-        <w:t xml:space="preserve">Accra, Ghana  |  +233 20 123 4567  |  john.doe@example.com</w:t>
+        <w:t>Accra, Ghana  |  +233 20 123 4567  |  ama.owusu@example.com</w:t>
       </w:r>
     </w:p>
     <w:p>
@@ -74,7 +74,7 @@
           <w:sz w:val="18"/>
           <w:szCs w:val="18"/>
         </w:rPr>
-        <w:t xml:space="preserve">linkedin.com/in/johndoe  |  github.com/johndoe</w:t>
+        <w:t>linkedin.com/in/amaowusu</w:t>
       </w:r>
     </w:p>
     <w:p>
@@ -105,7 +105,7 @@
           <w:sz w:val="20"/>
           <w:szCs w:val="20"/>
         </w:rPr>
-        <w:t xml:space="preserve">Frontend Developer with 3 years of experience building responsive, user-friendly web applications using React, JavaScript, and modern CSS frameworks. Passionate about clean interfaces, accessibility, and writing maintainable code.</w:t>
+        <w:t>Accountant with 3 years of experience managing financial records, preparing reports, and supporting audits for medium-sized organisations. Detail-oriented and reliable, with a strong grasp of bookkeeping, budgeting, and compliance.</w:t>
       </w:r>
     </w:p>
     <w:p>
@@ -138,7 +138,7 @@
           <w:sz w:val="22"/>
           <w:szCs w:val="22"/>
         </w:rPr>
-        <w:t xml:space="preserve">Frontend Developer</w:t>
+        <w:t>Accountant</w:t>
       </w:r>
     </w:p>
     <w:p>
@@ -151,7 +151,7 @@
           <w:sz w:val="20"/>
           <w:szCs w:val="20"/>
         </w:rPr>
-        <w:t xml:space="preserve">Acme Web Studio, Accra</w:t>
+        <w:t>Sunrise Trading Ltd, Accra</w:t>
       </w:r>
     </w:p>
     <w:p>
@@ -184,7 +184,7 @@
           <w:sz w:val="20"/>
           <w:szCs w:val="20"/>
         </w:rPr>
-        <w:t xml:space="preserve">Built and maintained responsive web applications using React, JavaScript, and Tailwind CSS.</w:t>
+        <w:t>Prepared monthly financial statements and management reports for review by senior staff.</w:t>
       </w:r>
     </w:p>
     <w:p>
@@ -202,7 +202,7 @@
           <w:sz w:val="20"/>
           <w:szCs w:val="20"/>
         </w:rPr>
-        <w:t xml:space="preserve">Collaborated with designers to translate Figma mockups into pixel-accurate interfaces.</w:t>
+        <w:t>Managed accounts payable and receivable, reconciling ledgers and resolving discrepancies.</w:t>
       </w:r>
     </w:p>
     <w:p>
@@ -220,7 +220,7 @@
           <w:sz w:val="20"/>
           <w:szCs w:val="20"/>
         </w:rPr>
-        <w:t xml:space="preserve">Improved page load performance and accessibility across the company's main product.</w:t>
+        <w:t>Supported the annual audit and helped ensure compliance with tax regulations.</w:t>
       </w:r>
     </w:p>
     <w:p>
@@ -235,7 +235,7 @@
           <w:sz w:val="22"/>
           <w:szCs w:val="22"/>
         </w:rPr>
-        <w:t xml:space="preserve">Junior Web Developer</w:t>
+        <w:t>Accounts Assistant</w:t>
       </w:r>
     </w:p>
     <w:p>
@@ -248,7 +248,7 @@
           <w:sz w:val="20"/>
           <w:szCs w:val="20"/>
         </w:rPr>
-        <w:t xml:space="preserve">BlueSky Digital, Kumasi</w:t>
+        <w:t>BlueSky Enterprise, Kumasi</w:t>
       </w:r>
     </w:p>
     <w:p>
@@ -281,7 +281,7 @@
           <w:sz w:val="20"/>
           <w:szCs w:val="20"/>
         </w:rPr>
-        <w:t xml:space="preserve">Developed reusable UI components and integrated REST APIs into web pages.</w:t>
+        <w:t>Recorded daily transactions and maintained accurate bookkeeping records.</w:t>
       </w:r>
     </w:p>
     <w:p>
@@ -299,7 +299,7 @@
           <w:sz w:val="20"/>
           <w:szCs w:val="20"/>
         </w:rPr>
-        <w:t xml:space="preserve">Assisted senior developers with bug fixes and feature implementation.</w:t>
+        <w:t>Assisted with payroll preparation and expense tracking.</w:t>
       </w:r>
     </w:p>
     <w:p>
@@ -332,7 +332,7 @@
           <w:sz w:val="22"/>
           <w:szCs w:val="22"/>
         </w:rPr>
-        <w:t xml:space="preserve">Bachelor of Science in Computer Science</w:t>
+        <w:t>Bachelor of Science in Accounting</w:t>
       </w:r>
     </w:p>
     <w:p>
@@ -375,7 +375,7 @@
           <w:sz w:val="20"/>
           <w:szCs w:val="20"/>
         </w:rPr>
-        <w:t xml:space="preserve">Relevant Courses: Data Structures &amp; Algorithms, Web Development, Human-Computer Interaction, Database Systems.</w:t>
+        <w:t>Relevant Courses: Financial Accounting, Auditing, Taxation, Business Management.</w:t>
       </w:r>
     </w:p>
     <w:p>
@@ -393,7 +393,7 @@
           <w:sz w:val="24"/>
           <w:szCs w:val="24"/>
         </w:rPr>
-        <w:t xml:space="preserve">PROJECTS</w:t>
+        <w:t>KEY ACHIEVEMENTS</w:t>
       </w:r>
     </w:p>
     <w:p>
@@ -408,7 +408,7 @@
           <w:sz w:val="22"/>
           <w:szCs w:val="22"/>
         </w:rPr>
-        <w:t xml:space="preserve">Weather Dashboard</w:t>
+        <w:t>Process Improvement</w:t>
       </w:r>
     </w:p>
     <w:p>
@@ -421,7 +421,7 @@
           <w:sz w:val="20"/>
           <w:szCs w:val="20"/>
         </w:rPr>
-        <w:t xml:space="preserve">React, JavaScript  |  Personal Project</w:t>
+        <w:t>Sunrise Trading Ltd</w:t>
       </w:r>
     </w:p>
     <w:p>
@@ -439,7 +439,7 @@
           <w:sz w:val="20"/>
           <w:szCs w:val="20"/>
         </w:rPr>
-        <w:t xml:space="preserve">Built a weather dashboard that fetches live data from a public API and displays forecasts with interactive charts.</w:t>
+        <w:t>Introduced a monthly reconciliation checklist that reduced reporting errors and sped up the month-end close.</w:t>
       </w:r>
     </w:p>
     <w:p>
@@ -454,7 +454,7 @@
           <w:sz w:val="22"/>
           <w:szCs w:val="22"/>
         </w:rPr>
-        <w:t xml:space="preserve">Recipe Finder App</w:t>
+        <w:t>Cost Savings</w:t>
       </w:r>
     </w:p>
     <w:p>
@@ -467,7 +467,7 @@
           <w:sz w:val="20"/>
           <w:szCs w:val="20"/>
         </w:rPr>
-        <w:t xml:space="preserve">React, JavaScript  |  Personal Project</w:t>
+        <w:t>BlueSky Enterprise</w:t>
       </w:r>
     </w:p>
     <w:p>
@@ -485,7 +485,7 @@
           <w:sz w:val="20"/>
           <w:szCs w:val="20"/>
         </w:rPr>
-        <w:t xml:space="preserve">Developed a recipe search application with filtering, favourites, and a responsive layout.</w:t>
+        <w:t>Identified and corrected recurring billing errors, recovering funds for the company.</w:t>
       </w:r>
     </w:p>
     <w:p>
@@ -503,7 +503,7 @@
           <w:sz w:val="24"/>
           <w:szCs w:val="24"/>
         </w:rPr>
-        <w:t xml:space="preserve">TECHNICAL SKILLS</w:t>
+        <w:t>KEY SKILLS</w:t>
       </w:r>
     </w:p>
     <w:p>
@@ -516,7 +516,7 @@
           <w:sz w:val="20"/>
           <w:szCs w:val="20"/>
         </w:rPr>
-        <w:t xml:space="preserve">Frontend: HTML, CSS, JavaScript, React, Tailwind CSS, Bootstrap</w:t>
+        <w:t>Finance: Bookkeeping, Financial Reporting, Budgeting, Accounts Payable &amp; Receivable, Auditing</w:t>
       </w:r>
     </w:p>
     <w:p>
@@ -529,7 +529,7 @@
           <w:sz w:val="20"/>
           <w:szCs w:val="20"/>
         </w:rPr>
-        <w:t xml:space="preserve">Tools: Git, GitHub, Figma, VS Code, Postman, Vercel</w:t>
+        <w:t>Tools: Microsoft Excel, QuickBooks, Tally, Microsoft Word</w:t>
       </w:r>
     </w:p>
     <w:p>
@@ -591,7 +591,7 @@
           <w:sz w:val="20"/>
           <w:szCs w:val="20"/>
         </w:rPr>
-        <w:t xml:space="preserve">Open-source contribution, UI design, football, photography.</w:t>
+        <w:t>Reading, community volunteering, football, photography.</w:t>
       </w:r>
     </w:p>
     <w:sectPr>

</xml_diff>